<commit_message>
add citation analysis in report
</commit_message>
<xml_diff>
--- a/paper_list/CFA Class-wise Calibrated Fair Adversarial Training/CFA Class-wise Calibrated Fair Adversarial Training.docx
+++ b/paper_list/CFA Class-wise Calibrated Fair Adversarial Training/CFA Class-wise Calibrated Fair Adversarial Training.docx
@@ -2,8 +2,10 @@
 <file path=word/document.xml><?xml version="1.0" encoding="utf-8"?>
 <w:document xmlns:wpc="http://schemas.microsoft.com/office/word/2010/wordprocessingCanvas" xmlns:mo="http://schemas.microsoft.com/office/mac/office/2008/main" xmlns:mc="http://schemas.openxmlformats.org/markup-compatibility/2006" xmlns:mv="urn:schemas-microsoft-com:mac:vml" xmlns:o="urn:schemas-microsoft-com:office:office" xmlns:r="http://schemas.openxmlformats.org/officeDocument/2006/relationships" xmlns:m="http://schemas.openxmlformats.org/officeDocument/2006/math" xmlns:v="urn:schemas-microsoft-com:vml" xmlns:wp14="http://schemas.microsoft.com/office/word/2010/wordprocessingDrawing" xmlns:wp="http://schemas.openxmlformats.org/drawingml/2006/wordprocessingDrawing" xmlns:w10="urn:schemas-microsoft-com:office:word" xmlns:w="http://schemas.openxmlformats.org/wordprocessingml/2006/main" xmlns:w14="http://schemas.microsoft.com/office/word/2010/wordml" xmlns:wpg="http://schemas.microsoft.com/office/word/2010/wordprocessingGroup" xmlns:wpi="http://schemas.microsoft.com/office/word/2010/wordprocessingInk" xmlns:wne="http://schemas.microsoft.com/office/word/2006/wordml" xmlns:wps="http://schemas.microsoft.com/office/word/2010/wordprocessingShape" mc:Ignorable="w14 wp14">
   <w:body>
+    <w:p/>
     <w:p>
       <w:pPr>
+        <w:spacing w:before="320"/>
         <w:ind w:firstLine="0"/>
         <w:jc w:val="left"/>
       </w:pPr>
@@ -20,6 +22,9 @@
         <w:r>
           <w:rPr>
             <w:rStyle w:val="Hyperlink"/>
+            <w:rFonts w:ascii="Arial" w:hAnsi="Arial"/>
+            <w:color w:val="0000FF"/>
+            <w:sz w:val="24"/>
           </w:rPr>
           <w:t>Adversarial training via multi-guidance and historical memory enhancement</w:t>
           <w:br/>
@@ -45,7 +50,6 @@
     </w:p>
     <w:p>
       <w:pPr>
-        <w:spacing w:before="320"/>
         <w:ind w:firstLine="0"/>
         <w:jc w:val="left"/>
       </w:pPr>
@@ -53,6 +57,53 @@
         <w:r>
           <w:rPr>
             <w:rStyle w:val="Hyperlink"/>
+            <w:rFonts w:ascii="Arial" w:hAnsi="Arial"/>
+            <w:color w:val="FF8000"/>
+            <w:sz w:val="20"/>
+          </w:rPr>
+          <w:t>S Ji: 14007</w:t>
+          <w:br/>
+        </w:r>
+      </w:hyperlink>
+      <w:hyperlink r:id="rId11">
+        <w:r>
+          <w:rPr>
+            <w:rStyle w:val="Hyperlink"/>
+            <w:rFonts w:ascii="Arial" w:hAnsi="Arial"/>
+            <w:color w:val="FF8000"/>
+            <w:sz w:val="20"/>
+          </w:rPr>
+          <w:t>W Wang: 7770</w:t>
+          <w:br/>
+        </w:r>
+      </w:hyperlink>
+      <w:hyperlink r:id="rId12">
+        <w:r>
+          <w:rPr>
+            <w:rStyle w:val="Hyperlink"/>
+            <w:rFonts w:ascii="Arial" w:hAnsi="Arial"/>
+            <w:color w:val="FF8000"/>
+            <w:sz w:val="20"/>
+          </w:rPr>
+          <w:t>Y Zhang: 20349</w:t>
+          <w:br/>
+        </w:r>
+      </w:hyperlink>
+    </w:p>
+    <w:p/>
+    <w:p>
+      <w:pPr>
+        <w:spacing w:before="320"/>
+        <w:ind w:firstLine="0"/>
+        <w:jc w:val="left"/>
+      </w:pPr>
+      <w:hyperlink r:id="rId13">
+        <w:r>
+          <w:rPr>
+            <w:rStyle w:val="Hyperlink"/>
+            <w:rFonts w:ascii="Arial" w:hAnsi="Arial"/>
+            <w:color w:val="0000FF"/>
+            <w:sz w:val="24"/>
           </w:rPr>
           <w:t>Exploring the robustness of in-context learning with noisy labels</w:t>
           <w:br/>
@@ -78,14 +129,46 @@
     </w:p>
     <w:p>
       <w:pPr>
+        <w:ind w:firstLine="0"/>
+        <w:jc w:val="left"/>
+      </w:pPr>
+      <w:hyperlink r:id="rId14">
+        <w:r>
+          <w:rPr>
+            <w:rStyle w:val="Hyperlink"/>
+            <w:rFonts w:ascii="Arial" w:hAnsi="Arial"/>
+            <w:color w:val="222222"/>
+            <w:sz w:val="20"/>
+          </w:rPr>
+          <w:t>H Wen: 28</w:t>
+          <w:br/>
+        </w:r>
+      </w:hyperlink>
+      <w:r>
+        <w:rPr>
+          <w:rFonts w:ascii="Arial" w:hAnsi="Arial"/>
+          <w:i/>
+          <w:color w:val="C80000"/>
+          <w:sz w:val="20"/>
+        </w:rPr>
+        <w:t>[Author info incomplete]</w:t>
+        <w:br/>
+      </w:r>
+    </w:p>
+    <w:p/>
+    <w:p>
+      <w:pPr>
         <w:spacing w:before="320"/>
         <w:ind w:firstLine="0"/>
         <w:jc w:val="left"/>
       </w:pPr>
-      <w:hyperlink r:id="rId11">
+      <w:hyperlink r:id="rId15">
         <w:r>
           <w:rPr>
             <w:rStyle w:val="Hyperlink"/>
+            <w:rFonts w:ascii="Arial" w:hAnsi="Arial"/>
+            <w:color w:val="0000FF"/>
+            <w:sz w:val="24"/>
           </w:rPr>
           <w:t>Parameter interpolation adversarial training for robust image classification</w:t>
           <w:br/>
@@ -111,6 +194,37 @@
     </w:p>
     <w:p>
       <w:pPr>
+        <w:ind w:firstLine="0"/>
+        <w:jc w:val="left"/>
+      </w:pPr>
+      <w:hyperlink r:id="rId16">
+        <w:r>
+          <w:rPr>
+            <w:rStyle w:val="Hyperlink"/>
+            <w:rFonts w:ascii="Arial" w:hAnsi="Arial"/>
+            <w:color w:val="FF8000"/>
+            <w:sz w:val="20"/>
+          </w:rPr>
+          <w:t>K He: 8937</w:t>
+          <w:br/>
+        </w:r>
+      </w:hyperlink>
+      <w:hyperlink r:id="rId17">
+        <w:r>
+          <w:rPr>
+            <w:rStyle w:val="Hyperlink"/>
+            <w:rFonts w:ascii="Arial" w:hAnsi="Arial"/>
+            <w:color w:val="FF8000"/>
+            <w:sz w:val="20"/>
+          </w:rPr>
+          <w:t>JE Hopcroft: 86509</w:t>
+          <w:br/>
+        </w:r>
+      </w:hyperlink>
+    </w:p>
+    <w:p/>
+    <w:p>
+      <w:pPr>
         <w:spacing w:before="320"/>
         <w:ind w:firstLine="0"/>
         <w:jc w:val="left"/>
@@ -124,10 +238,13 @@
         <w:t>[PDF not downloaded]</w:t>
         <w:br/>
       </w:r>
-      <w:hyperlink r:id="rId12">
+      <w:hyperlink r:id="rId18">
         <w:r>
           <w:rPr>
             <w:rStyle w:val="Hyperlink"/>
+            <w:rFonts w:ascii="Arial" w:hAnsi="Arial"/>
+            <w:color w:val="0000FF"/>
+            <w:sz w:val="24"/>
           </w:rPr>
           <w:t>Mitigate discrimination caused by data bias: Learning fair representations with information reinforcement via recurrent encoding</w:t>
           <w:br/>
@@ -151,16 +268,20 @@
         <w:t>With the wide application of artificial intelligence in information management and assisted decision-making, biases in the data have become an inevitable issue. Algorithms may …</w:t>
       </w:r>
     </w:p>
+    <w:p/>
     <w:p>
       <w:pPr>
         <w:spacing w:before="320"/>
         <w:ind w:firstLine="0"/>
         <w:jc w:val="left"/>
       </w:pPr>
-      <w:hyperlink r:id="rId13">
+      <w:hyperlink r:id="rId19">
         <w:r>
           <w:rPr>
             <w:rStyle w:val="Hyperlink"/>
+            <w:rFonts w:ascii="Arial" w:hAnsi="Arial"/>
+            <w:color w:val="0000FF"/>
+            <w:sz w:val="24"/>
           </w:rPr>
           <w:t>Aroid: Improving adversarial robustness through online instance-wise data augmentation</w:t>
           <w:br/>
@@ -186,14 +307,60 @@
     </w:p>
     <w:p>
       <w:pPr>
+        <w:ind w:firstLine="0"/>
+        <w:jc w:val="left"/>
+      </w:pPr>
+      <w:hyperlink r:id="rId20">
+        <w:r>
+          <w:rPr>
+            <w:rStyle w:val="Hyperlink"/>
+            <w:rFonts w:ascii="Arial" w:hAnsi="Arial"/>
+            <w:color w:val="222222"/>
+            <w:sz w:val="20"/>
+          </w:rPr>
+          <w:t>L Li: 656</w:t>
+          <w:br/>
+        </w:r>
+      </w:hyperlink>
+      <w:hyperlink r:id="rId21">
+        <w:r>
+          <w:rPr>
+            <w:rStyle w:val="Hyperlink"/>
+            <w:rFonts w:ascii="Arial" w:hAnsi="Arial"/>
+            <w:color w:val="222222"/>
+            <w:sz w:val="20"/>
+          </w:rPr>
+          <w:t>J Qiu: 2048</w:t>
+          <w:br/>
+        </w:r>
+      </w:hyperlink>
+      <w:hyperlink r:id="rId22">
+        <w:r>
+          <w:rPr>
+            <w:rStyle w:val="Hyperlink"/>
+            <w:rFonts w:ascii="Arial" w:hAnsi="Arial"/>
+            <w:color w:val="FF8000"/>
+            <w:sz w:val="20"/>
+          </w:rPr>
+          <w:t>M Spratling: 6246</w:t>
+          <w:br/>
+        </w:r>
+      </w:hyperlink>
+    </w:p>
+    <w:p/>
+    <w:p>
+      <w:pPr>
         <w:spacing w:before="320"/>
         <w:ind w:firstLine="0"/>
         <w:jc w:val="left"/>
       </w:pPr>
-      <w:hyperlink r:id="rId14">
+      <w:hyperlink r:id="rId23">
         <w:r>
           <w:rPr>
             <w:rStyle w:val="Hyperlink"/>
+            <w:rFonts w:ascii="Arial" w:hAnsi="Arial"/>
+            <w:color w:val="0000FF"/>
+            <w:sz w:val="24"/>
           </w:rPr>
           <w:t>Towards adversarial robustness via debiased high-confidence logit alignment</w:t>
           <w:br/>
@@ -219,14 +386,83 @@
     </w:p>
     <w:p>
       <w:pPr>
+        <w:ind w:firstLine="0"/>
+        <w:jc w:val="left"/>
+      </w:pPr>
+      <w:hyperlink r:id="rId24">
+        <w:r>
+          <w:rPr>
+            <w:rStyle w:val="Hyperlink"/>
+            <w:rFonts w:ascii="Arial" w:hAnsi="Arial"/>
+            <w:color w:val="222222"/>
+            <w:sz w:val="20"/>
+          </w:rPr>
+          <w:t>J Weng: 117</w:t>
+          <w:br/>
+        </w:r>
+      </w:hyperlink>
+      <w:hyperlink r:id="rId25">
+        <w:r>
+          <w:rPr>
+            <w:rStyle w:val="Hyperlink"/>
+            <w:rFonts w:ascii="Arial" w:hAnsi="Arial"/>
+            <w:color w:val="FF8000"/>
+            <w:sz w:val="20"/>
+          </w:rPr>
+          <w:t>S Li: 18708</w:t>
+          <w:br/>
+        </w:r>
+      </w:hyperlink>
+      <w:hyperlink r:id="rId26">
+        <w:r>
+          <w:rPr>
+            <w:rStyle w:val="Hyperlink"/>
+            <w:rFonts w:ascii="Arial" w:hAnsi="Arial"/>
+            <w:color w:val="FF8000"/>
+            <w:sz w:val="20"/>
+          </w:rPr>
+          <w:t>Z Luo: 10005</w:t>
+          <w:br/>
+        </w:r>
+      </w:hyperlink>
+    </w:p>
+    <w:p>
+      <w:pPr>
+        <w:ind w:firstLine="0"/>
+      </w:pPr>
+      <w:r>
+        <w:rPr>
+          <w:rFonts w:ascii="Arial" w:hAnsi="Arial"/>
+          <w:i/>
+          <w:color w:val="323232"/>
+          <w:sz w:val="20"/>
+        </w:rPr>
+        <w:t>"DHAT-CFA (Ours) 80.97 52.38 2.09 70.52 47.83 2.21 78.52 52.67 2.44"</w:t>
+        <w:br/>
+      </w:r>
+      <w:r>
+        <w:rPr>
+          <w:rFonts w:ascii="Microsoft YaHei" w:hAnsi="Microsoft YaHei" w:eastAsia="Microsoft YaHei"/>
+          <w:color w:val="00008B"/>
+          <w:sz w:val="20"/>
+        </w:rPr>
+        <w:t>Analysis: 结合了被引论文的方法CFA，构建了新方法DHAT-CFA，并展示了其性能。</w:t>
+      </w:r>
+    </w:p>
+    <w:p/>
+    <w:p>
+      <w:pPr>
         <w:spacing w:before="320"/>
         <w:ind w:firstLine="0"/>
         <w:jc w:val="left"/>
       </w:pPr>
-      <w:hyperlink r:id="rId15">
+      <w:hyperlink r:id="rId27">
         <w:r>
           <w:rPr>
             <w:rStyle w:val="Hyperlink"/>
+            <w:rFonts w:ascii="Arial" w:hAnsi="Arial"/>
+            <w:color w:val="0000FF"/>
+            <w:sz w:val="24"/>
           </w:rPr>
           <w:t>FAIR-TAT: Improving Model Fairness Using Targeted Adversarial Training</w:t>
           <w:br/>
@@ -252,6 +488,164 @@
     </w:p>
     <w:p>
       <w:pPr>
+        <w:ind w:firstLine="0"/>
+        <w:jc w:val="left"/>
+      </w:pPr>
+      <w:hyperlink r:id="rId28">
+        <w:r>
+          <w:rPr>
+            <w:rStyle w:val="Hyperlink"/>
+            <w:rFonts w:ascii="Arial" w:hAnsi="Arial"/>
+            <w:color w:val="222222"/>
+            <w:sz w:val="20"/>
+          </w:rPr>
+          <w:t>T Medi: 15</w:t>
+          <w:br/>
+        </w:r>
+      </w:hyperlink>
+      <w:hyperlink r:id="rId29">
+        <w:r>
+          <w:rPr>
+            <w:rStyle w:val="Hyperlink"/>
+            <w:rFonts w:ascii="Arial" w:hAnsi="Arial"/>
+            <w:color w:val="222222"/>
+            <w:sz w:val="20"/>
+          </w:rPr>
+          <w:t>S Jung: 330</w:t>
+          <w:br/>
+        </w:r>
+      </w:hyperlink>
+      <w:hyperlink r:id="rId30">
+        <w:r>
+          <w:rPr>
+            <w:rStyle w:val="Hyperlink"/>
+            <w:rFonts w:ascii="Arial" w:hAnsi="Arial"/>
+            <w:color w:val="FF8000"/>
+            <w:sz w:val="20"/>
+          </w:rPr>
+          <w:t>M Keuper: 8520</w:t>
+          <w:br/>
+        </w:r>
+      </w:hyperlink>
+    </w:p>
+    <w:p>
+      <w:pPr>
+        <w:ind w:firstLine="0"/>
+      </w:pPr>
+      <w:r>
+        <w:rPr>
+          <w:rFonts w:ascii="Arial" w:hAnsi="Arial"/>
+          <w:i/>
+          <w:color w:val="323232"/>
+          <w:sz w:val="20"/>
+        </w:rPr>
+        <w:t>"Following the notation in [44], we consider a function f_θ:X → Y parameterized by θ representing the K-class classification problem with Y = {1, 2, ..., K}."</w:t>
+        <w:br/>
+      </w:r>
+      <w:r>
+        <w:rPr>
+          <w:rFonts w:ascii="Microsoft YaHei" w:hAnsi="Microsoft YaHei" w:eastAsia="Microsoft YaHei"/>
+          <w:color w:val="00008B"/>
+          <w:sz w:val="20"/>
+        </w:rPr>
+        <w:t>Analysis: 参照了被引工作的符号定义来设置问题框架</w:t>
+      </w:r>
+    </w:p>
+    <w:p>
+      <w:pPr>
+        <w:ind w:firstLine="0"/>
+      </w:pPr>
+      <w:r>
+        <w:rPr>
+          <w:rFonts w:ascii="Arial" w:hAnsi="Arial"/>
+          <w:i/>
+          <w:color w:val="323232"/>
+          <w:sz w:val="20"/>
+        </w:rPr>
+        <w:t>"We use robust accuracy for customizing the perturbation margin for each class as showcased in [44], that various classes exhibit distinct preferences for perturbation margins during adversarial training, a critical factor in improving fairness."</w:t>
+        <w:br/>
+      </w:r>
+      <w:r>
+        <w:rPr>
+          <w:rFonts w:ascii="Microsoft YaHei" w:hAnsi="Microsoft YaHei" w:eastAsia="Microsoft YaHei"/>
+          <w:color w:val="00008B"/>
+          <w:sz w:val="20"/>
+        </w:rPr>
+        <w:t>Analysis: 引用了被引论文[44]来展示如何根据鲁棒精度定制扰动边界，并说明这是提高公平性的关键因素，属于深入参考被引论文内容。</w:t>
+      </w:r>
+    </w:p>
+    <w:p>
+      <w:pPr>
+        <w:ind w:firstLine="0"/>
+      </w:pPr>
+      <w:r>
+        <w:rPr>
+          <w:rFonts w:ascii="Arial" w:hAnsi="Arial"/>
+          <w:i/>
+          <w:color w:val="323232"/>
+          <w:sz w:val="20"/>
+        </w:rPr>
+        <w:t>"We use the update formula from [44] for scaling the ϵ, which is mentioned in line 27 of Algorithm 1."</w:t>
+        <w:br/>
+      </w:r>
+      <w:r>
+        <w:rPr>
+          <w:rFonts w:ascii="Microsoft YaHei" w:hAnsi="Microsoft YaHei" w:eastAsia="Microsoft YaHei"/>
+          <w:color w:val="00008B"/>
+          <w:sz w:val="20"/>
+        </w:rPr>
+        <w:t>Analysis: 直接使用了被引论文[44]中的更新公式来缩放扰动边界，属于应用被引论文方法解决新问题。</w:t>
+      </w:r>
+    </w:p>
+    <w:p>
+      <w:pPr>
+        <w:ind w:firstLine="0"/>
+      </w:pPr>
+      <w:r>
+        <w:rPr>
+          <w:rFonts w:ascii="Arial" w:hAnsi="Arial"/>
+          <w:i/>
+          <w:color w:val="323232"/>
+          <w:sz w:val="20"/>
+        </w:rPr>
+        <w:t>"We also adapt CFA [44], TRADES [49] and FAT [51] according to our approach and compare the results with their respective baseline versions."</w:t>
+        <w:br/>
+      </w:r>
+      <w:r>
+        <w:rPr>
+          <w:rFonts w:ascii="Microsoft YaHei" w:hAnsi="Microsoft YaHei" w:eastAsia="Microsoft YaHei"/>
+          <w:color w:val="00008B"/>
+          <w:sz w:val="20"/>
+        </w:rPr>
+        <w:t>Analysis: 应用了被引论文的方法进行适配和比较，属于深入参考被引论文内容。</w:t>
+      </w:r>
+    </w:p>
+    <w:p>
+      <w:pPr>
+        <w:ind w:firstLine="0"/>
+      </w:pPr>
+      <w:r>
+        <w:rPr>
+          <w:rFonts w:ascii="Arial" w:hAnsi="Arial"/>
+          <w:i/>
+          <w:color w:val="323232"/>
+          <w:sz w:val="20"/>
+        </w:rPr>
+        <w:t>"Furthermore, we apply weight averaging techniques, such as Fairness Aware Weight Average (FAWA) [44] as in CFA and Exponential Moving Average (EMA) as well for our approach."</w:t>
+        <w:br/>
+      </w:r>
+      <w:r>
+        <w:rPr>
+          <w:rFonts w:ascii="Microsoft YaHei" w:hAnsi="Microsoft YaHei" w:eastAsia="Microsoft YaHei"/>
+          <w:color w:val="00008B"/>
+          <w:sz w:val="20"/>
+        </w:rPr>
+        <w:t>Analysis: 应用了被引论文中的技术（FAWA），属于深入参考被引论文内容。</w:t>
+      </w:r>
+    </w:p>
+    <w:p/>
+    <w:p>
+      <w:pPr>
         <w:spacing w:before="320"/>
         <w:ind w:firstLine="0"/>
         <w:jc w:val="left"/>
@@ -265,10 +659,13 @@
         <w:t>[PDF not downloaded]</w:t>
         <w:br/>
       </w:r>
-      <w:hyperlink r:id="rId16">
+      <w:hyperlink r:id="rId31">
         <w:r>
           <w:rPr>
             <w:rStyle w:val="Hyperlink"/>
+            <w:rFonts w:ascii="Arial" w:hAnsi="Arial"/>
+            <w:color w:val="0000FF"/>
+            <w:sz w:val="24"/>
           </w:rPr>
           <w:t>CATIL: Customized adversarial training based on instance loss</w:t>
           <w:br/>
@@ -294,14 +691,36 @@
     </w:p>
     <w:p>
       <w:pPr>
+        <w:ind w:firstLine="0"/>
+        <w:jc w:val="left"/>
+      </w:pPr>
+      <w:hyperlink r:id="rId32">
+        <w:r>
+          <w:rPr>
+            <w:rStyle w:val="Hyperlink"/>
+            <w:rFonts w:ascii="Arial" w:hAnsi="Arial"/>
+            <w:color w:val="222222"/>
+            <w:sz w:val="20"/>
+          </w:rPr>
+          <w:t>H Xia: 2088</w:t>
+          <w:br/>
+        </w:r>
+      </w:hyperlink>
+    </w:p>
+    <w:p/>
+    <w:p>
+      <w:pPr>
         <w:spacing w:before="320"/>
         <w:ind w:firstLine="0"/>
         <w:jc w:val="left"/>
       </w:pPr>
-      <w:hyperlink r:id="rId17">
+      <w:hyperlink r:id="rId33">
         <w:r>
           <w:rPr>
             <w:rStyle w:val="Hyperlink"/>
+            <w:rFonts w:ascii="Arial" w:hAnsi="Arial"/>
+            <w:color w:val="0000FF"/>
+            <w:sz w:val="24"/>
           </w:rPr>
           <w:t>Mitigating low-frequency bias: Feature recalibration and frequency attention regularization for adversarial robustness</w:t>
           <w:br/>
@@ -327,6 +746,49 @@
     </w:p>
     <w:p>
       <w:pPr>
+        <w:ind w:firstLine="0"/>
+        <w:jc w:val="left"/>
+      </w:pPr>
+      <w:hyperlink r:id="rId34">
+        <w:r>
+          <w:rPr>
+            <w:rStyle w:val="Hyperlink"/>
+            <w:rFonts w:ascii="Arial" w:hAnsi="Arial"/>
+            <w:color w:val="222222"/>
+            <w:sz w:val="20"/>
+          </w:rPr>
+          <w:t>Y Cai: 596</w:t>
+          <w:br/>
+        </w:r>
+      </w:hyperlink>
+      <w:hyperlink r:id="rId25">
+        <w:r>
+          <w:rPr>
+            <w:rStyle w:val="Hyperlink"/>
+            <w:rFonts w:ascii="Arial" w:hAnsi="Arial"/>
+            <w:color w:val="FF8000"/>
+            <w:sz w:val="20"/>
+          </w:rPr>
+          <w:t>S Li: 18708</w:t>
+          <w:br/>
+        </w:r>
+      </w:hyperlink>
+      <w:hyperlink r:id="rId26">
+        <w:r>
+          <w:rPr>
+            <w:rStyle w:val="Hyperlink"/>
+            <w:rFonts w:ascii="Arial" w:hAnsi="Arial"/>
+            <w:color w:val="FF8000"/>
+            <w:sz w:val="20"/>
+          </w:rPr>
+          <w:t>Z Luo: 10005</w:t>
+          <w:br/>
+        </w:r>
+      </w:hyperlink>
+    </w:p>
+    <w:p/>
+    <w:p>
+      <w:pPr>
         <w:spacing w:before="320"/>
         <w:ind w:firstLine="0"/>
         <w:jc w:val="left"/>
@@ -340,10 +802,13 @@
         <w:t>[PDF not downloaded]</w:t>
         <w:br/>
       </w:r>
-      <w:hyperlink r:id="rId18">
+      <w:hyperlink r:id="rId35">
         <w:r>
           <w:rPr>
             <w:rStyle w:val="Hyperlink"/>
+            <w:rFonts w:ascii="Arial" w:hAnsi="Arial"/>
+            <w:color w:val="0000FF"/>
+            <w:sz w:val="24"/>
           </w:rPr>
           <w:t>Enhancing Robust Fairness via Confusional Spectral Regularization</w:t>
           <w:br/>
@@ -369,6 +834,49 @@
     </w:p>
     <w:p>
       <w:pPr>
+        <w:ind w:firstLine="0"/>
+        <w:jc w:val="left"/>
+      </w:pPr>
+      <w:hyperlink r:id="rId36">
+        <w:r>
+          <w:rPr>
+            <w:rStyle w:val="Hyperlink"/>
+            <w:rFonts w:ascii="Arial" w:hAnsi="Arial"/>
+            <w:color w:val="222222"/>
+            <w:sz w:val="20"/>
+          </w:rPr>
+          <w:t>J Liu: 41</w:t>
+          <w:br/>
+        </w:r>
+      </w:hyperlink>
+      <w:hyperlink r:id="rId37">
+        <w:r>
+          <w:rPr>
+            <w:rStyle w:val="Hyperlink"/>
+            <w:rFonts w:ascii="Arial" w:hAnsi="Arial"/>
+            <w:color w:val="222222"/>
+            <w:sz w:val="20"/>
+          </w:rPr>
+          <w:t>T Huang: 606</w:t>
+          <w:br/>
+        </w:r>
+      </w:hyperlink>
+      <w:hyperlink r:id="rId38">
+        <w:r>
+          <w:rPr>
+            <w:rStyle w:val="Hyperlink"/>
+            <w:rFonts w:ascii="Arial" w:hAnsi="Arial"/>
+            <w:color w:val="222222"/>
+            <w:sz w:val="20"/>
+          </w:rPr>
+          <w:t>R Mu: 661</w:t>
+          <w:br/>
+        </w:r>
+      </w:hyperlink>
+    </w:p>
+    <w:p/>
+    <w:p>
+      <w:pPr>
         <w:spacing w:before="320"/>
         <w:ind w:firstLine="0"/>
         <w:jc w:val="left"/>
@@ -382,10 +890,13 @@
         <w:t>[PDF not downloaded]</w:t>
         <w:br/>
       </w:r>
-      <w:hyperlink r:id="rId19">
+      <w:hyperlink r:id="rId39">
         <w:r>
           <w:rPr>
             <w:rStyle w:val="Hyperlink"/>
+            <w:rFonts w:ascii="Arial" w:hAnsi="Arial"/>
+            <w:color w:val="0000FF"/>
+            <w:sz w:val="24"/>
           </w:rPr>
           <w:t>Fast adversarial training with weak-to-strong spatial-temporal consistency in the frequency domain on videos</w:t>
           <w:br/>
@@ -411,6 +922,59 @@
     </w:p>
     <w:p>
       <w:pPr>
+        <w:ind w:firstLine="0"/>
+        <w:jc w:val="left"/>
+      </w:pPr>
+      <w:hyperlink r:id="rId40">
+        <w:r>
+          <w:rPr>
+            <w:rStyle w:val="Hyperlink"/>
+            <w:rFonts w:ascii="Arial" w:hAnsi="Arial"/>
+            <w:color w:val="222222"/>
+            <w:sz w:val="20"/>
+          </w:rPr>
+          <w:t>X Hu: 230</w:t>
+          <w:br/>
+        </w:r>
+      </w:hyperlink>
+      <w:hyperlink r:id="rId41">
+        <w:r>
+          <w:rPr>
+            <w:rStyle w:val="Hyperlink"/>
+            <w:rFonts w:ascii="Arial" w:hAnsi="Arial"/>
+            <w:color w:val="222222"/>
+            <w:sz w:val="20"/>
+          </w:rPr>
+          <w:t>Z He: 442</w:t>
+          <w:br/>
+        </w:r>
+      </w:hyperlink>
+      <w:hyperlink r:id="rId42">
+        <w:r>
+          <w:rPr>
+            <w:rStyle w:val="Hyperlink"/>
+            <w:rFonts w:ascii="Arial" w:hAnsi="Arial"/>
+            <w:color w:val="222222"/>
+            <w:sz w:val="20"/>
+          </w:rPr>
+          <w:t>W Wang: 4961</w:t>
+          <w:br/>
+        </w:r>
+      </w:hyperlink>
+      <w:r>
+        <w:rPr>
+          <w:rFonts w:ascii="Arial" w:hAnsi="Arial"/>
+          <w:i/>
+          <w:color w:val="C80000"/>
+          <w:sz w:val="20"/>
+        </w:rPr>
+        <w:t>[Author info incomplete]</w:t>
+        <w:br/>
+      </w:r>
+    </w:p>
+    <w:p/>
+    <w:p>
+      <w:pPr>
         <w:spacing w:before="320"/>
         <w:ind w:firstLine="0"/>
         <w:jc w:val="left"/>
@@ -424,10 +988,13 @@
         <w:t>[PDF not downloaded]</w:t>
         <w:br/>
       </w:r>
-      <w:hyperlink r:id="rId20">
+      <w:hyperlink r:id="rId43">
         <w:r>
           <w:rPr>
             <w:rStyle w:val="Hyperlink"/>
+            <w:rFonts w:ascii="Arial" w:hAnsi="Arial"/>
+            <w:color w:val="0000FF"/>
+            <w:sz w:val="24"/>
           </w:rPr>
           <w:t>Rect-ViT: Rectified attention via feature attribution can improve the adversarial robustness of Vision Transformers</w:t>
           <w:br/>
@@ -453,6 +1020,25 @@
     </w:p>
     <w:p>
       <w:pPr>
+        <w:ind w:firstLine="0"/>
+        <w:jc w:val="left"/>
+      </w:pPr>
+      <w:hyperlink r:id="rId44">
+        <w:r>
+          <w:rPr>
+            <w:rStyle w:val="Hyperlink"/>
+            <w:rFonts w:ascii="Arial" w:hAnsi="Arial"/>
+            <w:color w:val="222222"/>
+            <w:sz w:val="20"/>
+          </w:rPr>
+          <w:t>B Song: 4080</w:t>
+          <w:br/>
+        </w:r>
+      </w:hyperlink>
+    </w:p>
+    <w:p/>
+    <w:p>
+      <w:pPr>
         <w:spacing w:before="320"/>
         <w:ind w:firstLine="0"/>
         <w:jc w:val="left"/>
@@ -466,10 +1052,13 @@
         <w:t>[PDF not downloaded]</w:t>
         <w:br/>
       </w:r>
-      <w:hyperlink r:id="rId21">
+      <w:hyperlink r:id="rId45">
         <w:r>
           <w:rPr>
             <w:rStyle w:val="Hyperlink"/>
+            <w:rFonts w:ascii="Arial" w:hAnsi="Arial"/>
+            <w:color w:val="0000FF"/>
+            <w:sz w:val="24"/>
           </w:rPr>
           <w:t>Generative adversarial defense via conditional diffusion model</w:t>
           <w:br/>
@@ -495,6 +1084,25 @@
     </w:p>
     <w:p>
       <w:pPr>
+        <w:ind w:firstLine="0"/>
+        <w:jc w:val="left"/>
+      </w:pPr>
+      <w:hyperlink r:id="rId46">
+        <w:r>
+          <w:rPr>
+            <w:rStyle w:val="Hyperlink"/>
+            <w:rFonts w:ascii="Arial" w:hAnsi="Arial"/>
+            <w:color w:val="222222"/>
+            <w:sz w:val="20"/>
+          </w:rPr>
+          <w:t>YG Wang: 1321</w:t>
+          <w:br/>
+        </w:r>
+      </w:hyperlink>
+    </w:p>
+    <w:p/>
+    <w:p>
+      <w:pPr>
         <w:spacing w:before="320"/>
         <w:ind w:firstLine="0"/>
         <w:jc w:val="left"/>
@@ -508,10 +1116,13 @@
         <w:t>[PDF not downloaded]</w:t>
         <w:br/>
       </w:r>
-      <w:hyperlink r:id="rId22">
+      <w:hyperlink r:id="rId47">
         <w:r>
           <w:rPr>
             <w:rStyle w:val="Hyperlink"/>
+            <w:rFonts w:ascii="Arial" w:hAnsi="Arial"/>
+            <w:color w:val="0000FF"/>
+            <w:sz w:val="24"/>
           </w:rPr>
           <w:t>M3C: Resist Agnostic Attacks by Mitigating Consistent Class Confusion Prior</w:t>
           <w:br/>
@@ -537,6 +1148,23 @@
     </w:p>
     <w:p>
       <w:pPr>
+        <w:ind w:firstLine="0"/>
+        <w:jc w:val="left"/>
+      </w:pPr>
+      <w:r>
+        <w:rPr>
+          <w:rFonts w:ascii="Arial" w:hAnsi="Arial"/>
+          <w:i/>
+          <w:color w:val="C80000"/>
+          <w:sz w:val="20"/>
+        </w:rPr>
+        <w:t>[Author info incomplete]</w:t>
+        <w:br/>
+      </w:r>
+    </w:p>
+    <w:p/>
+    <w:p>
+      <w:pPr>
         <w:spacing w:before="320"/>
         <w:ind w:firstLine="0"/>
         <w:jc w:val="left"/>
@@ -550,10 +1178,13 @@
         <w:t>[PDF not downloaded]</w:t>
         <w:br/>
       </w:r>
-      <w:hyperlink r:id="rId23">
+      <w:hyperlink r:id="rId48">
         <w:r>
           <w:rPr>
             <w:rStyle w:val="Hyperlink"/>
+            <w:rFonts w:ascii="Arial" w:hAnsi="Arial"/>
+            <w:color w:val="0000FF"/>
+            <w:sz w:val="24"/>
           </w:rPr>
           <w:t>Defending Against Adversarial Examples Via Modeling Adversarial Noise</w:t>
           <w:br/>
@@ -579,6 +1210,49 @@
     </w:p>
     <w:p>
       <w:pPr>
+        <w:ind w:firstLine="0"/>
+        <w:jc w:val="left"/>
+      </w:pPr>
+      <w:hyperlink r:id="rId49">
+        <w:r>
+          <w:rPr>
+            <w:rStyle w:val="Hyperlink"/>
+            <w:rFonts w:ascii="Arial" w:hAnsi="Arial"/>
+            <w:color w:val="FF8000"/>
+            <w:sz w:val="20"/>
+          </w:rPr>
+          <w:t>B Han: 15990</w:t>
+          <w:br/>
+        </w:r>
+      </w:hyperlink>
+      <w:hyperlink r:id="rId50">
+        <w:r>
+          <w:rPr>
+            <w:rStyle w:val="Hyperlink"/>
+            <w:rFonts w:ascii="Arial" w:hAnsi="Arial"/>
+            <w:color w:val="FF8000"/>
+            <w:sz w:val="20"/>
+          </w:rPr>
+          <w:t>T Liu: 25537</w:t>
+          <w:br/>
+        </w:r>
+      </w:hyperlink>
+      <w:hyperlink r:id="rId51">
+        <w:r>
+          <w:rPr>
+            <w:rStyle w:val="Hyperlink"/>
+            <w:rFonts w:ascii="Arial" w:hAnsi="Arial"/>
+            <w:color w:val="FF8000"/>
+            <w:sz w:val="20"/>
+          </w:rPr>
+          <w:t>X Gao: 52136</w:t>
+          <w:br/>
+        </w:r>
+      </w:hyperlink>
+    </w:p>
+    <w:p/>
+    <w:p>
+      <w:pPr>
         <w:spacing w:before="320"/>
         <w:ind w:firstLine="0"/>
         <w:jc w:val="left"/>
@@ -592,10 +1266,13 @@
         <w:t>[PDF not downloaded]</w:t>
         <w:br/>
       </w:r>
-      <w:hyperlink r:id="rId24">
+      <w:hyperlink r:id="rId52">
         <w:r>
           <w:rPr>
             <w:rStyle w:val="Hyperlink"/>
+            <w:rFonts w:ascii="Arial" w:hAnsi="Arial"/>
+            <w:color w:val="0000FF"/>
+            <w:sz w:val="24"/>
           </w:rPr>
           <w:t>Improving Fast Adversarial Training via Self-Knowledge Guidance</w:t>
           <w:br/>
@@ -621,6 +1298,59 @@
     </w:p>
     <w:p>
       <w:pPr>
+        <w:ind w:firstLine="0"/>
+        <w:jc w:val="left"/>
+      </w:pPr>
+      <w:hyperlink r:id="rId53">
+        <w:r>
+          <w:rPr>
+            <w:rStyle w:val="Hyperlink"/>
+            <w:rFonts w:ascii="Arial" w:hAnsi="Arial"/>
+            <w:color w:val="222222"/>
+            <w:sz w:val="20"/>
+          </w:rPr>
+          <w:t>M Dong: 806</w:t>
+          <w:br/>
+        </w:r>
+      </w:hyperlink>
+      <w:hyperlink r:id="rId54">
+        <w:r>
+          <w:rPr>
+            <w:rStyle w:val="Hyperlink"/>
+            <w:rFonts w:ascii="Arial" w:hAnsi="Arial"/>
+            <w:color w:val="FF8000"/>
+            <w:sz w:val="20"/>
+          </w:rPr>
+          <w:t>J Gui: 6855</w:t>
+          <w:br/>
+        </w:r>
+      </w:hyperlink>
+      <w:hyperlink r:id="rId55">
+        <w:r>
+          <w:rPr>
+            <w:rStyle w:val="Hyperlink"/>
+            <w:rFonts w:ascii="Arial" w:hAnsi="Arial"/>
+            <w:color w:val="222222"/>
+            <w:sz w:val="20"/>
+          </w:rPr>
+          <w:t>X Shi: 1135</w:t>
+          <w:br/>
+        </w:r>
+      </w:hyperlink>
+      <w:r>
+        <w:rPr>
+          <w:rFonts w:ascii="Arial" w:hAnsi="Arial"/>
+          <w:i/>
+          <w:color w:val="C80000"/>
+          <w:sz w:val="20"/>
+        </w:rPr>
+        <w:t>[Author info incomplete]</w:t>
+        <w:br/>
+      </w:r>
+    </w:p>
+    <w:p/>
+    <w:p>
+      <w:pPr>
         <w:spacing w:before="320"/>
         <w:ind w:firstLine="0"/>
         <w:jc w:val="left"/>
@@ -634,10 +1364,13 @@
         <w:t>[PDF not downloaded]</w:t>
         <w:br/>
       </w:r>
-      <w:hyperlink r:id="rId25">
+      <w:hyperlink r:id="rId56">
         <w:r>
           <w:rPr>
             <w:rStyle w:val="Hyperlink"/>
+            <w:rFonts w:ascii="Arial" w:hAnsi="Arial"/>
+            <w:color w:val="0000FF"/>
+            <w:sz w:val="24"/>
           </w:rPr>
           <w:t>Identifying and Understanding Cross-Class Features in Adversarial Training</w:t>
           <w:br/>
@@ -663,6 +1396,49 @@
     </w:p>
     <w:p>
       <w:pPr>
+        <w:ind w:firstLine="0"/>
+        <w:jc w:val="left"/>
+      </w:pPr>
+      <w:hyperlink r:id="rId57">
+        <w:r>
+          <w:rPr>
+            <w:rStyle w:val="Hyperlink"/>
+            <w:rFonts w:ascii="Arial" w:hAnsi="Arial"/>
+            <w:color w:val="222222"/>
+            <w:sz w:val="20"/>
+          </w:rPr>
+          <w:t>Z Wei: 973</w:t>
+          <w:br/>
+        </w:r>
+      </w:hyperlink>
+      <w:hyperlink r:id="rId58">
+        <w:r>
+          <w:rPr>
+            <w:rStyle w:val="Hyperlink"/>
+            <w:rFonts w:ascii="Arial" w:hAnsi="Arial"/>
+            <w:color w:val="FF8000"/>
+            <w:sz w:val="20"/>
+          </w:rPr>
+          <w:t>Y Guo: 5800</w:t>
+          <w:br/>
+        </w:r>
+      </w:hyperlink>
+      <w:hyperlink r:id="rId59">
+        <w:r>
+          <w:rPr>
+            <w:rStyle w:val="Hyperlink"/>
+            <w:rFonts w:ascii="Arial" w:hAnsi="Arial"/>
+            <w:color w:val="FF8000"/>
+            <w:sz w:val="20"/>
+          </w:rPr>
+          <w:t>Y Wang: 13448</w:t>
+          <w:br/>
+        </w:r>
+      </w:hyperlink>
+    </w:p>
+    <w:p/>
+    <w:p>
+      <w:pPr>
         <w:spacing w:before="320"/>
         <w:ind w:firstLine="0"/>
         <w:jc w:val="left"/>
@@ -676,10 +1452,13 @@
         <w:t>[PDF not downloaded]</w:t>
         <w:br/>
       </w:r>
-      <w:hyperlink r:id="rId26">
+      <w:hyperlink r:id="rId60">
         <w:r>
           <w:rPr>
             <w:rStyle w:val="Hyperlink"/>
+            <w:rFonts w:ascii="Arial" w:hAnsi="Arial"/>
+            <w:color w:val="0000FF"/>
+            <w:sz w:val="24"/>
           </w:rPr>
           <w:t>Enhancing robust generalization through appropriate adversarial example attack intensity</w:t>
           <w:br/>
@@ -705,6 +1484,35 @@
     </w:p>
     <w:p>
       <w:pPr>
+        <w:ind w:firstLine="0"/>
+        <w:jc w:val="left"/>
+      </w:pPr>
+      <w:hyperlink r:id="rId61">
+        <w:r>
+          <w:rPr>
+            <w:rStyle w:val="Hyperlink"/>
+            <w:rFonts w:ascii="Arial" w:hAnsi="Arial"/>
+            <w:color w:val="222222"/>
+            <w:sz w:val="20"/>
+          </w:rPr>
+          <w:t>Z Gu: 4397</w:t>
+          <w:br/>
+        </w:r>
+      </w:hyperlink>
+      <w:r>
+        <w:rPr>
+          <w:rFonts w:ascii="Arial" w:hAnsi="Arial"/>
+          <w:i/>
+          <w:color w:val="C80000"/>
+          <w:sz w:val="20"/>
+        </w:rPr>
+        <w:t>[Author info incomplete]</w:t>
+        <w:br/>
+      </w:r>
+    </w:p>
+    <w:p/>
+    <w:p>
+      <w:pPr>
         <w:spacing w:before="320"/>
         <w:ind w:firstLine="0"/>
         <w:jc w:val="left"/>
@@ -718,10 +1526,13 @@
         <w:t>[PDF not downloaded]</w:t>
         <w:br/>
       </w:r>
-      <w:hyperlink r:id="rId27">
+      <w:hyperlink r:id="rId62">
         <w:r>
           <w:rPr>
             <w:rStyle w:val="Hyperlink"/>
+            <w:rFonts w:ascii="Arial" w:hAnsi="Arial"/>
+            <w:color w:val="0000FF"/>
+            <w:sz w:val="24"/>
           </w:rPr>
           <w:t>Unrevealed Threats: Adversarial Robustness Analysis of Underwater Image Enhancement Models</w:t>
           <w:br/>
@@ -747,6 +1558,59 @@
     </w:p>
     <w:p>
       <w:pPr>
+        <w:ind w:firstLine="0"/>
+        <w:jc w:val="left"/>
+      </w:pPr>
+      <w:hyperlink r:id="rId63">
+        <w:r>
+          <w:rPr>
+            <w:rStyle w:val="Hyperlink"/>
+            <w:rFonts w:ascii="Arial" w:hAnsi="Arial"/>
+            <w:color w:val="222222"/>
+            <w:sz w:val="20"/>
+          </w:rPr>
+          <w:t>X Cong: 507</w:t>
+          <w:br/>
+        </w:r>
+      </w:hyperlink>
+      <w:hyperlink r:id="rId64">
+        <w:r>
+          <w:rPr>
+            <w:rStyle w:val="Hyperlink"/>
+            <w:rFonts w:ascii="Arial" w:hAnsi="Arial"/>
+            <w:color w:val="222222"/>
+            <w:sz w:val="20"/>
+          </w:rPr>
+          <w:t>J Hou: 522</w:t>
+          <w:br/>
+        </w:r>
+      </w:hyperlink>
+      <w:hyperlink r:id="rId54">
+        <w:r>
+          <w:rPr>
+            <w:rStyle w:val="Hyperlink"/>
+            <w:rFonts w:ascii="Arial" w:hAnsi="Arial"/>
+            <w:color w:val="FF8000"/>
+            <w:sz w:val="20"/>
+          </w:rPr>
+          <w:t>J Gui: 6855</w:t>
+          <w:br/>
+        </w:r>
+      </w:hyperlink>
+      <w:r>
+        <w:rPr>
+          <w:rFonts w:ascii="Arial" w:hAnsi="Arial"/>
+          <w:i/>
+          <w:color w:val="C80000"/>
+          <w:sz w:val="20"/>
+        </w:rPr>
+        <w:t>[Author info incomplete]</w:t>
+        <w:br/>
+      </w:r>
+    </w:p>
+    <w:p/>
+    <w:p>
+      <w:pPr>
         <w:spacing w:before="320"/>
         <w:ind w:firstLine="0"/>
         <w:jc w:val="left"/>
@@ -760,10 +1624,13 @@
         <w:t>[PDF not downloaded]</w:t>
         <w:br/>
       </w:r>
-      <w:hyperlink r:id="rId28">
+      <w:hyperlink r:id="rId65">
         <w:r>
           <w:rPr>
             <w:rStyle w:val="Hyperlink"/>
+            <w:rFonts w:ascii="Arial" w:hAnsi="Arial"/>
+            <w:color w:val="0000FF"/>
+            <w:sz w:val="24"/>
           </w:rPr>
           <w:t>Improving Adversarial Training From the Perspective of Class-Flipping Distribution</w:t>
           <w:br/>
@@ -789,6 +1656,49 @@
     </w:p>
     <w:p>
       <w:pPr>
+        <w:ind w:firstLine="0"/>
+        <w:jc w:val="left"/>
+      </w:pPr>
+      <w:hyperlink r:id="rId66">
+        <w:r>
+          <w:rPr>
+            <w:rStyle w:val="Hyperlink"/>
+            <w:rFonts w:ascii="Arial" w:hAnsi="Arial"/>
+            <w:color w:val="FF8000"/>
+            <w:sz w:val="20"/>
+          </w:rPr>
+          <w:t>N Wang: 12364</w:t>
+          <w:br/>
+        </w:r>
+      </w:hyperlink>
+      <w:hyperlink r:id="rId50">
+        <w:r>
+          <w:rPr>
+            <w:rStyle w:val="Hyperlink"/>
+            <w:rFonts w:ascii="Arial" w:hAnsi="Arial"/>
+            <w:color w:val="FF8000"/>
+            <w:sz w:val="20"/>
+          </w:rPr>
+          <w:t>T Liu: 25537</w:t>
+          <w:br/>
+        </w:r>
+      </w:hyperlink>
+      <w:hyperlink r:id="rId51">
+        <w:r>
+          <w:rPr>
+            <w:rStyle w:val="Hyperlink"/>
+            <w:rFonts w:ascii="Arial" w:hAnsi="Arial"/>
+            <w:color w:val="FF8000"/>
+            <w:sz w:val="20"/>
+          </w:rPr>
+          <w:t>X Gao: 52136</w:t>
+          <w:br/>
+        </w:r>
+      </w:hyperlink>
+    </w:p>
+    <w:p/>
+    <w:p>
+      <w:pPr>
         <w:spacing w:before="320"/>
         <w:ind w:firstLine="0"/>
         <w:jc w:val="left"/>
@@ -802,10 +1712,13 @@
         <w:t>[PDF not downloaded]</w:t>
         <w:br/>
       </w:r>
-      <w:hyperlink r:id="rId29">
+      <w:hyperlink r:id="rId67">
         <w:r>
           <w:rPr>
             <w:rStyle w:val="Hyperlink"/>
+            <w:rFonts w:ascii="Arial" w:hAnsi="Arial"/>
+            <w:color w:val="0000FF"/>
+            <w:sz w:val="24"/>
           </w:rPr>
           <w:t>Defending Against Transfer-Based Adversarial Attacks Using SVD-Driven Feature Evolution</w:t>
           <w:br/>
@@ -831,6 +1744,23 @@
     </w:p>
     <w:p>
       <w:pPr>
+        <w:ind w:firstLine="0"/>
+        <w:jc w:val="left"/>
+      </w:pPr>
+      <w:r>
+        <w:rPr>
+          <w:rFonts w:ascii="Arial" w:hAnsi="Arial"/>
+          <w:i/>
+          <w:color w:val="C80000"/>
+          <w:sz w:val="20"/>
+        </w:rPr>
+        <w:t>[Author info incomplete]</w:t>
+        <w:br/>
+      </w:r>
+    </w:p>
+    <w:p/>
+    <w:p>
+      <w:pPr>
         <w:spacing w:before="320"/>
         <w:ind w:firstLine="0"/>
         <w:jc w:val="left"/>
@@ -844,10 +1774,13 @@
         <w:t>[PDF not downloaded]</w:t>
         <w:br/>
       </w:r>
-      <w:hyperlink r:id="rId30">
+      <w:hyperlink r:id="rId68">
         <w:r>
           <w:rPr>
             <w:rStyle w:val="Hyperlink"/>
+            <w:rFonts w:ascii="Arial" w:hAnsi="Arial"/>
+            <w:color w:val="0000FF"/>
+            <w:sz w:val="24"/>
           </w:rPr>
           <w:t>Adversarial Self-Supervised Learning for Secure and Robust Urban Region Profiling</w:t>
           <w:br/>
@@ -869,6 +1802,58 @@
           <w:sz w:val="20"/>
         </w:rPr>
         <w:t>Urban region profiling is essential for forecasting and decision-making in dynamic and noisy urban environments. However, existing approaches struggle with adversarial attacks, data …</w:t>
+      </w:r>
+    </w:p>
+    <w:p>
+      <w:pPr>
+        <w:ind w:firstLine="0"/>
+        <w:jc w:val="left"/>
+      </w:pPr>
+      <w:hyperlink r:id="rId69">
+        <w:r>
+          <w:rPr>
+            <w:rStyle w:val="Hyperlink"/>
+            <w:rFonts w:ascii="Arial" w:hAnsi="Arial"/>
+            <w:color w:val="222222"/>
+            <w:sz w:val="20"/>
+          </w:rPr>
+          <w:t>W Chen: 14</w:t>
+          <w:br/>
+        </w:r>
+      </w:hyperlink>
+      <w:hyperlink r:id="rId70">
+        <w:r>
+          <w:rPr>
+            <w:rStyle w:val="Hyperlink"/>
+            <w:rFonts w:ascii="Arial" w:hAnsi="Arial"/>
+            <w:color w:val="222222"/>
+            <w:sz w:val="20"/>
+          </w:rPr>
+          <w:t>Q Ren: 509</w:t>
+          <w:br/>
+        </w:r>
+      </w:hyperlink>
+      <w:hyperlink r:id="rId71">
+        <w:r>
+          <w:rPr>
+            <w:rStyle w:val="Hyperlink"/>
+            <w:rFonts w:ascii="Arial" w:hAnsi="Arial"/>
+            <w:color w:val="222222"/>
+            <w:sz w:val="20"/>
+          </w:rPr>
+          <w:t>Y Liu: 1289</w:t>
+          <w:br/>
+        </w:r>
+      </w:hyperlink>
+      <w:r>
+        <w:rPr>
+          <w:rFonts w:ascii="Arial" w:hAnsi="Arial"/>
+          <w:i/>
+          <w:color w:val="C80000"/>
+          <w:sz w:val="20"/>
+        </w:rPr>
+        <w:t>[Author info incomplete]</w:t>
+        <w:br/>
       </w:r>
     </w:p>
     <w:sectPr>
@@ -12940,7 +13925,6 @@
     <w:rPr>
       <w:rFonts w:ascii="Arial" w:hAnsi="Arial"/>
       <w:color w:val="0000FF"/>
-      <w:sz w:val="26"/>
       <w:u w:val="single"/>
     </w:rPr>
   </w:style>

</xml_diff>